<commit_message>
26-05-26, Blog solidariteit afgemaakt
</commit_message>
<xml_diff>
--- a/BlogsWord/Werkmakenvansolidariteit.docx
+++ b/BlogsWord/Werkmakenvansolidariteit.docx
@@ -174,23 +174,31 @@
           <w:sz w:val="22"/>
           <w:szCs w:val="22"/>
         </w:rPr>
-        <w:t>. H</w:t>
-      </w:r>
-      <w:r>
-        <w:rPr>
-          <w:rFonts w:ascii="Courier New" w:hAnsi="Courier New" w:cs="Courier New"/>
-          <w:sz w:val="22"/>
-          <w:szCs w:val="22"/>
-        </w:rPr>
-        <w:t xml:space="preserve">ij </w:t>
-      </w:r>
-      <w:r>
-        <w:rPr>
-          <w:rFonts w:ascii="Courier New" w:hAnsi="Courier New" w:cs="Courier New"/>
-          <w:sz w:val="22"/>
-          <w:szCs w:val="22"/>
-        </w:rPr>
-        <w:t>was van 2002 tot in 2012 a</w:t>
+        <w:t xml:space="preserve"> </w:t>
+      </w:r>
+      <w:r>
+        <w:rPr>
+          <w:rFonts w:ascii="Courier New" w:hAnsi="Courier New" w:cs="Courier New"/>
+          <w:sz w:val="22"/>
+          <w:szCs w:val="22"/>
+        </w:rPr>
+        <w:t xml:space="preserve">van 2002 tot 2012 </w:t>
+      </w:r>
+      <w:r>
+        <w:rPr>
+          <w:rFonts w:ascii="Courier New" w:hAnsi="Courier New" w:cs="Courier New"/>
+          <w:sz w:val="22"/>
+          <w:szCs w:val="22"/>
+        </w:rPr>
+        <w:t xml:space="preserve">was hij </w:t>
+      </w:r>
+      <w:r>
+        <w:rPr>
+          <w:rFonts w:ascii="Courier New" w:hAnsi="Courier New" w:cs="Courier New"/>
+          <w:sz w:val="22"/>
+          <w:szCs w:val="22"/>
+        </w:rPr>
+        <w:t>a</w:t>
       </w:r>
       <w:r>
         <w:rPr>
@@ -222,7 +230,7 @@
           <w:sz w:val="22"/>
           <w:szCs w:val="22"/>
         </w:rPr>
-        <w:t xml:space="preserve">soms </w:t>
+        <w:t xml:space="preserve">niet zelden </w:t>
       </w:r>
       <w:r>
         <w:rPr>
@@ -556,7 +564,23 @@
           <w:sz w:val="22"/>
           <w:szCs w:val="22"/>
         </w:rPr>
-        <w:t xml:space="preserve">wat het eigenlijk betekent. Op allerlei plekken in de wereld </w:t>
+        <w:t xml:space="preserve">wat het eigenlijk betekent. Op </w:t>
+      </w:r>
+      <w:r>
+        <w:rPr>
+          <w:rFonts w:ascii="Courier New" w:hAnsi="Courier New" w:cs="Courier New"/>
+          <w:sz w:val="22"/>
+          <w:szCs w:val="22"/>
+        </w:rPr>
+        <w:t>heel veel</w:t>
+      </w:r>
+      <w:r>
+        <w:rPr>
+          <w:rFonts w:ascii="Courier New" w:hAnsi="Courier New" w:cs="Courier New"/>
+          <w:sz w:val="22"/>
+          <w:szCs w:val="22"/>
+        </w:rPr>
+        <w:t xml:space="preserve"> plekken in de wereld </w:t>
       </w:r>
       <w:r>
         <w:rPr>
@@ -588,7 +612,39 @@
           <w:sz w:val="22"/>
           <w:szCs w:val="22"/>
         </w:rPr>
-        <w:t xml:space="preserve">lezingen en seminars over houden. </w:t>
+        <w:t xml:space="preserve">lezingen en seminars over </w:t>
+      </w:r>
+      <w:r>
+        <w:rPr>
+          <w:rFonts w:ascii="Courier New" w:hAnsi="Courier New" w:cs="Courier New"/>
+          <w:sz w:val="22"/>
+          <w:szCs w:val="22"/>
+        </w:rPr>
+        <w:t>ge</w:t>
+      </w:r>
+      <w:r>
+        <w:rPr>
+          <w:rFonts w:ascii="Courier New" w:hAnsi="Courier New" w:cs="Courier New"/>
+          <w:sz w:val="22"/>
+          <w:szCs w:val="22"/>
+        </w:rPr>
+        <w:t>houden</w:t>
+      </w:r>
+      <w:r>
+        <w:rPr>
+          <w:rFonts w:ascii="Courier New" w:hAnsi="Courier New" w:cs="Courier New"/>
+          <w:sz w:val="22"/>
+          <w:szCs w:val="22"/>
+        </w:rPr>
+        <w:t xml:space="preserve"> en met dit boek heeft hij daar een geheel van gemaakt</w:t>
+      </w:r>
+      <w:r>
+        <w:rPr>
+          <w:rFonts w:ascii="Courier New" w:hAnsi="Courier New" w:cs="Courier New"/>
+          <w:sz w:val="22"/>
+          <w:szCs w:val="22"/>
+        </w:rPr>
+        <w:t xml:space="preserve">. </w:t>
       </w:r>
     </w:p>
     <w:p>
@@ -601,22 +657,6 @@
           <w:szCs w:val="22"/>
         </w:rPr>
       </w:pPr>
-      <w:r>
-        <w:rPr>
-          <w:rFonts w:ascii="Courier New" w:hAnsi="Courier New" w:cs="Courier New"/>
-          <w:sz w:val="22"/>
-          <w:szCs w:val="22"/>
-        </w:rPr>
-        <w:t xml:space="preserve">Solidariteit </w:t>
-      </w:r>
-      <w:r>
-        <w:rPr>
-          <w:rFonts w:ascii="Courier New" w:hAnsi="Courier New" w:cs="Courier New"/>
-          <w:sz w:val="22"/>
-          <w:szCs w:val="22"/>
-        </w:rPr>
-        <w:t xml:space="preserve">heeft te maken met dat voortdurende werk van erkenning en jezelf bevragen te maken. </w:t>
-      </w:r>
       <w:r>
         <w:rPr>
           <w:rFonts w:ascii="Courier New" w:hAnsi="Courier New" w:cs="Courier New"/>
@@ -938,7 +978,7 @@
           <w:sz w:val="22"/>
           <w:szCs w:val="22"/>
         </w:rPr>
-        <w:t>vreemde</w:t>
+        <w:t>ander</w:t>
       </w:r>
       <w:r>
         <w:rPr>
@@ -1010,7 +1050,87 @@
           <w:sz w:val="22"/>
           <w:szCs w:val="22"/>
         </w:rPr>
-        <w:t xml:space="preserve">. Er zijn veel krachten die het moeilijk maken om </w:t>
+        <w:t xml:space="preserve">. </w:t>
+      </w:r>
+      <w:r>
+        <w:rPr>
+          <w:rFonts w:ascii="Courier New" w:hAnsi="Courier New" w:cs="Courier New"/>
+          <w:sz w:val="22"/>
+          <w:szCs w:val="22"/>
+        </w:rPr>
+        <w:t>Solidariteit heeft te maken met dat voortdurende werk van erkenning en jezelf bevragen te maken.</w:t>
+      </w:r>
+      <w:r>
+        <w:rPr>
+          <w:rFonts w:ascii="Courier New" w:hAnsi="Courier New" w:cs="Courier New"/>
+          <w:sz w:val="22"/>
+          <w:szCs w:val="22"/>
+        </w:rPr>
+        <w:t xml:space="preserve"> </w:t>
+      </w:r>
+      <w:r>
+        <w:rPr>
+          <w:rFonts w:ascii="Courier New" w:hAnsi="Courier New" w:cs="Courier New"/>
+          <w:sz w:val="22"/>
+          <w:szCs w:val="22"/>
+        </w:rPr>
+        <w:t>Het gaat over lezen en gelezen worden</w:t>
+      </w:r>
+      <w:r>
+        <w:rPr>
+          <w:rFonts w:ascii="Courier New" w:hAnsi="Courier New" w:cs="Courier New"/>
+          <w:sz w:val="22"/>
+          <w:szCs w:val="22"/>
+        </w:rPr>
+        <w:t xml:space="preserve"> en dat is voor Williams een wederkerig proces van erkenning</w:t>
+      </w:r>
+      <w:r>
+        <w:rPr>
+          <w:rFonts w:ascii="Courier New" w:hAnsi="Courier New" w:cs="Courier New"/>
+          <w:sz w:val="22"/>
+          <w:szCs w:val="22"/>
+        </w:rPr>
+        <w:t>. Daarin spelen allerlei</w:t>
+      </w:r>
+      <w:r>
+        <w:rPr>
+          <w:rFonts w:ascii="Courier New" w:hAnsi="Courier New" w:cs="Courier New"/>
+          <w:sz w:val="22"/>
+          <w:szCs w:val="22"/>
+        </w:rPr>
+        <w:t xml:space="preserve"> krachten </w:t>
+      </w:r>
+      <w:r>
+        <w:rPr>
+          <w:rFonts w:ascii="Courier New" w:hAnsi="Courier New" w:cs="Courier New"/>
+          <w:sz w:val="22"/>
+          <w:szCs w:val="22"/>
+        </w:rPr>
+        <w:t xml:space="preserve">mee </w:t>
+      </w:r>
+      <w:r>
+        <w:rPr>
+          <w:rFonts w:ascii="Courier New" w:hAnsi="Courier New" w:cs="Courier New"/>
+          <w:sz w:val="22"/>
+          <w:szCs w:val="22"/>
+        </w:rPr>
+        <w:t xml:space="preserve">die het </w:t>
+      </w:r>
+      <w:r>
+        <w:rPr>
+          <w:rFonts w:ascii="Courier New" w:hAnsi="Courier New" w:cs="Courier New"/>
+          <w:sz w:val="22"/>
+          <w:szCs w:val="22"/>
+        </w:rPr>
+        <w:t xml:space="preserve">ons </w:t>
+      </w:r>
+      <w:r>
+        <w:rPr>
+          <w:rFonts w:ascii="Courier New" w:hAnsi="Courier New" w:cs="Courier New"/>
+          <w:sz w:val="22"/>
+          <w:szCs w:val="22"/>
+        </w:rPr>
+        <w:t xml:space="preserve">moeilijk maken om </w:t>
       </w:r>
       <w:r>
         <w:rPr>
@@ -1026,23 +1146,39 @@
           <w:sz w:val="22"/>
           <w:szCs w:val="22"/>
         </w:rPr>
-        <w:t xml:space="preserve">de vreemde </w:t>
-      </w:r>
-      <w:r>
-        <w:rPr>
-          <w:rFonts w:ascii="Courier New" w:hAnsi="Courier New" w:cs="Courier New"/>
-          <w:sz w:val="22"/>
-          <w:szCs w:val="22"/>
-        </w:rPr>
-        <w:t xml:space="preserve">en </w:t>
-      </w:r>
-      <w:r>
-        <w:rPr>
-          <w:rFonts w:ascii="Courier New" w:hAnsi="Courier New" w:cs="Courier New"/>
-          <w:sz w:val="22"/>
-          <w:szCs w:val="22"/>
-        </w:rPr>
-        <w:t>om solidair te kunnen zijn</w:t>
+        <w:t>‘de ander’</w:t>
+      </w:r>
+      <w:r>
+        <w:rPr>
+          <w:rFonts w:ascii="Courier New" w:hAnsi="Courier New" w:cs="Courier New"/>
+          <w:sz w:val="22"/>
+          <w:szCs w:val="22"/>
+        </w:rPr>
+        <w:t xml:space="preserve"> </w:t>
+      </w:r>
+      <w:r>
+        <w:rPr>
+          <w:rFonts w:ascii="Courier New" w:hAnsi="Courier New" w:cs="Courier New"/>
+          <w:sz w:val="22"/>
+          <w:szCs w:val="22"/>
+        </w:rPr>
+        <w:t xml:space="preserve">om te gaan </w:t>
+      </w:r>
+      <w:r>
+        <w:rPr>
+          <w:rFonts w:ascii="Courier New" w:hAnsi="Courier New" w:cs="Courier New"/>
+          <w:sz w:val="22"/>
+          <w:szCs w:val="22"/>
+        </w:rPr>
+        <w:t>en</w:t>
+      </w:r>
+      <w:r>
+        <w:rPr>
+          <w:rFonts w:ascii="Courier New" w:hAnsi="Courier New" w:cs="Courier New"/>
+          <w:sz w:val="22"/>
+          <w:szCs w:val="22"/>
+        </w:rPr>
+        <w:t xml:space="preserve"> solidair te kunnen zijn</w:t>
       </w:r>
       <w:r>
         <w:rPr>
@@ -1098,15 +1234,15 @@
           <w:sz w:val="22"/>
           <w:szCs w:val="22"/>
         </w:rPr>
-        <w:t>,</w:t>
-      </w:r>
-      <w:r>
-        <w:rPr>
-          <w:rFonts w:ascii="Courier New" w:hAnsi="Courier New" w:cs="Courier New"/>
-          <w:sz w:val="22"/>
-          <w:szCs w:val="22"/>
-        </w:rPr>
-        <w:t xml:space="preserve"> dan hoef je alleen maar aan </w:t>
+        <w:t xml:space="preserve"> en </w:t>
+      </w:r>
+      <w:r>
+        <w:rPr>
+          <w:rFonts w:ascii="Courier New" w:hAnsi="Courier New" w:cs="Courier New"/>
+          <w:sz w:val="22"/>
+          <w:szCs w:val="22"/>
+        </w:rPr>
+        <w:t xml:space="preserve">dan hoef je alleen maar aan </w:t>
       </w:r>
       <w:r>
         <w:rPr>
@@ -1210,7 +1346,7 @@
           <w:sz w:val="22"/>
           <w:szCs w:val="22"/>
         </w:rPr>
-        <w:t>,</w:t>
+        <w:t xml:space="preserve"> dat je serieus en waar je de tijd voor moet nemen.</w:t>
       </w:r>
       <w:r>
         <w:rPr>
@@ -1226,15 +1362,15 @@
           <w:sz w:val="22"/>
           <w:szCs w:val="22"/>
         </w:rPr>
-        <w:t xml:space="preserve">want </w:t>
-      </w:r>
-      <w:r>
-        <w:rPr>
-          <w:rFonts w:ascii="Courier New" w:hAnsi="Courier New" w:cs="Courier New"/>
-          <w:sz w:val="22"/>
-          <w:szCs w:val="22"/>
-        </w:rPr>
-        <w:t xml:space="preserve">er </w:t>
+        <w:t>Er</w:t>
+      </w:r>
+      <w:r>
+        <w:rPr>
+          <w:rFonts w:ascii="Courier New" w:hAnsi="Courier New" w:cs="Courier New"/>
+          <w:sz w:val="22"/>
+          <w:szCs w:val="22"/>
+        </w:rPr>
+        <w:t xml:space="preserve"> </w:t>
       </w:r>
       <w:r>
         <w:rPr>
@@ -1258,55 +1394,7 @@
           <w:sz w:val="22"/>
           <w:szCs w:val="22"/>
         </w:rPr>
-        <w:t>,</w:t>
-      </w:r>
-      <w:r>
-        <w:rPr>
-          <w:rFonts w:ascii="Courier New" w:hAnsi="Courier New" w:cs="Courier New"/>
-          <w:sz w:val="22"/>
-          <w:szCs w:val="22"/>
-        </w:rPr>
-        <w:t xml:space="preserve"> </w:t>
-      </w:r>
-      <w:r>
-        <w:rPr>
-          <w:rFonts w:ascii="Courier New" w:hAnsi="Courier New" w:cs="Courier New"/>
-          <w:sz w:val="22"/>
-          <w:szCs w:val="22"/>
-        </w:rPr>
-        <w:t xml:space="preserve">en </w:t>
-      </w:r>
-      <w:r>
-        <w:rPr>
-          <w:rFonts w:ascii="Courier New" w:hAnsi="Courier New" w:cs="Courier New"/>
-          <w:sz w:val="22"/>
-          <w:szCs w:val="22"/>
-        </w:rPr>
-        <w:t>dat</w:t>
-      </w:r>
-      <w:r>
-        <w:rPr>
-          <w:rFonts w:ascii="Courier New" w:hAnsi="Courier New" w:cs="Courier New"/>
-          <w:sz w:val="22"/>
-          <w:szCs w:val="22"/>
-        </w:rPr>
-        <w:t xml:space="preserve"> </w:t>
-      </w:r>
-      <w:r>
-        <w:rPr>
-          <w:rFonts w:ascii="Courier New" w:hAnsi="Courier New" w:cs="Courier New"/>
-          <w:sz w:val="22"/>
-          <w:szCs w:val="22"/>
-        </w:rPr>
-        <w:t xml:space="preserve">moet </w:t>
-      </w:r>
-      <w:r>
-        <w:rPr>
-          <w:rFonts w:ascii="Courier New" w:hAnsi="Courier New" w:cs="Courier New"/>
-          <w:sz w:val="22"/>
-          <w:szCs w:val="22"/>
-        </w:rPr>
-        <w:t>verricht moet wil solidariteit werkelijk</w:t>
+        <w:t xml:space="preserve"> wil solidariteit werkelijk</w:t>
       </w:r>
       <w:r>
         <w:rPr>
@@ -1323,70 +1411,6 @@
           <w:szCs w:val="22"/>
         </w:rPr>
         <w:t>.</w:t>
-      </w:r>
-      <w:r>
-        <w:rPr>
-          <w:rFonts w:ascii="Courier New" w:hAnsi="Courier New" w:cs="Courier New"/>
-          <w:sz w:val="22"/>
-          <w:szCs w:val="22"/>
-        </w:rPr>
-        <w:t xml:space="preserve"> </w:t>
-      </w:r>
-      <w:r>
-        <w:rPr>
-          <w:rFonts w:ascii="Courier New" w:hAnsi="Courier New" w:cs="Courier New"/>
-          <w:sz w:val="22"/>
-          <w:szCs w:val="22"/>
-        </w:rPr>
-        <w:t xml:space="preserve">Het delen van </w:t>
-      </w:r>
-      <w:r>
-        <w:rPr>
-          <w:rFonts w:ascii="Courier New" w:hAnsi="Courier New" w:cs="Courier New"/>
-          <w:sz w:val="22"/>
-          <w:szCs w:val="22"/>
-        </w:rPr>
-        <w:t xml:space="preserve">gevoelens </w:t>
-      </w:r>
-      <w:r>
-        <w:rPr>
-          <w:rFonts w:ascii="Courier New" w:hAnsi="Courier New" w:cs="Courier New"/>
-          <w:sz w:val="22"/>
-          <w:szCs w:val="22"/>
-        </w:rPr>
-        <w:t>met</w:t>
-      </w:r>
-      <w:r>
-        <w:rPr>
-          <w:rFonts w:ascii="Courier New" w:hAnsi="Courier New" w:cs="Courier New"/>
-          <w:sz w:val="22"/>
-          <w:szCs w:val="22"/>
-        </w:rPr>
-        <w:t xml:space="preserve"> een ander </w:t>
-      </w:r>
-      <w:r>
-        <w:rPr>
-          <w:rFonts w:ascii="Courier New" w:hAnsi="Courier New" w:cs="Courier New"/>
-          <w:sz w:val="22"/>
-          <w:szCs w:val="22"/>
-        </w:rPr>
-        <w:t>is geen eenvoudige kwestie</w:t>
-      </w:r>
-      <w:r>
-        <w:rPr>
-          <w:rFonts w:ascii="Courier New" w:hAnsi="Courier New" w:cs="Courier New"/>
-          <w:sz w:val="22"/>
-          <w:szCs w:val="22"/>
-        </w:rPr>
-        <w:t>.</w:t>
-      </w:r>
-      <w:r>
-        <w:rPr>
-          <w:rFonts w:ascii="Courier New" w:hAnsi="Courier New" w:cs="Courier New"/>
-          <w:sz w:val="22"/>
-          <w:szCs w:val="22"/>
-        </w:rPr>
-        <w:t xml:space="preserve"> </w:t>
       </w:r>
       <w:r>
         <w:rPr>
@@ -1445,47 +1469,39 @@
           <w:sz w:val="22"/>
           <w:szCs w:val="22"/>
         </w:rPr>
-        <w:t xml:space="preserve">op. </w:t>
-      </w:r>
-      <w:r>
-        <w:rPr>
-          <w:rFonts w:ascii="Courier New" w:hAnsi="Courier New" w:cs="Courier New"/>
-          <w:sz w:val="22"/>
-          <w:szCs w:val="22"/>
-        </w:rPr>
-        <w:t xml:space="preserve">De ervaringen van deze </w:t>
-      </w:r>
-      <w:r>
-        <w:rPr>
-          <w:rFonts w:ascii="Courier New" w:hAnsi="Courier New" w:cs="Courier New"/>
-          <w:sz w:val="22"/>
-          <w:szCs w:val="22"/>
-        </w:rPr>
-        <w:t xml:space="preserve">denkers </w:t>
-      </w:r>
-      <w:r>
-        <w:rPr>
-          <w:rFonts w:ascii="Courier New" w:hAnsi="Courier New" w:cs="Courier New"/>
-          <w:sz w:val="22"/>
-          <w:szCs w:val="22"/>
-        </w:rPr>
-        <w:t xml:space="preserve">waar Williams zijn ideeën op baseert </w:t>
-      </w:r>
-      <w:r>
-        <w:rPr>
-          <w:rFonts w:ascii="Courier New" w:hAnsi="Courier New" w:cs="Courier New"/>
-          <w:sz w:val="22"/>
-          <w:szCs w:val="22"/>
-        </w:rPr>
-        <w:t xml:space="preserve">zijn </w:t>
-      </w:r>
-      <w:r>
-        <w:rPr>
-          <w:rFonts w:ascii="Courier New" w:hAnsi="Courier New" w:cs="Courier New"/>
-          <w:sz w:val="22"/>
-          <w:szCs w:val="22"/>
-        </w:rPr>
-        <w:t>gevormd door</w:t>
+        <w:t>verder uit</w:t>
+      </w:r>
+      <w:r>
+        <w:rPr>
+          <w:rFonts w:ascii="Courier New" w:hAnsi="Courier New" w:cs="Courier New"/>
+          <w:sz w:val="22"/>
+          <w:szCs w:val="22"/>
+        </w:rPr>
+        <w:t xml:space="preserve">. </w:t>
+      </w:r>
+      <w:r>
+        <w:rPr>
+          <w:rFonts w:ascii="Courier New" w:hAnsi="Courier New" w:cs="Courier New"/>
+          <w:sz w:val="22"/>
+          <w:szCs w:val="22"/>
+        </w:rPr>
+        <w:t xml:space="preserve">Hun werk is </w:t>
+      </w:r>
+      <w:r>
+        <w:rPr>
+          <w:rFonts w:ascii="Courier New" w:hAnsi="Courier New" w:cs="Courier New"/>
+          <w:sz w:val="22"/>
+          <w:szCs w:val="22"/>
+        </w:rPr>
+        <w:t xml:space="preserve">gevormd </w:t>
+      </w:r>
+      <w:r>
+        <w:rPr>
+          <w:rFonts w:ascii="Courier New" w:hAnsi="Courier New" w:cs="Courier New"/>
+          <w:sz w:val="22"/>
+          <w:szCs w:val="22"/>
+        </w:rPr>
+        <w:t>in</w:t>
       </w:r>
       <w:r>
         <w:rPr>
@@ -1605,15 +1621,15 @@
           <w:sz w:val="22"/>
           <w:szCs w:val="22"/>
         </w:rPr>
-        <w:t xml:space="preserve">Daar hoorde </w:t>
-      </w:r>
-      <w:r>
-        <w:rPr>
-          <w:rFonts w:ascii="Courier New" w:hAnsi="Courier New" w:cs="Courier New"/>
-          <w:sz w:val="22"/>
-          <w:szCs w:val="22"/>
-        </w:rPr>
-        <w:t xml:space="preserve">voor </w:t>
+        <w:t>Daar</w:t>
+      </w:r>
+      <w:r>
+        <w:rPr>
+          <w:rFonts w:ascii="Courier New" w:hAnsi="Courier New" w:cs="Courier New"/>
+          <w:sz w:val="22"/>
+          <w:szCs w:val="22"/>
+        </w:rPr>
+        <w:t xml:space="preserve">voor wilde </w:t>
       </w:r>
       <w:r>
         <w:rPr>
@@ -1629,6 +1645,22 @@
           <w:sz w:val="22"/>
           <w:szCs w:val="22"/>
         </w:rPr>
+        <w:t xml:space="preserve"> de</w:t>
+      </w:r>
+      <w:r>
+        <w:rPr>
+          <w:rFonts w:ascii="Courier New" w:hAnsi="Courier New" w:cs="Courier New"/>
+          <w:sz w:val="22"/>
+          <w:szCs w:val="22"/>
+        </w:rPr>
+        <w:t xml:space="preserve"> politieke macht en morele doelen</w:t>
+      </w:r>
+      <w:r>
+        <w:rPr>
+          <w:rFonts w:ascii="Courier New" w:hAnsi="Courier New" w:cs="Courier New"/>
+          <w:sz w:val="22"/>
+          <w:szCs w:val="22"/>
+        </w:rPr>
         <w:t xml:space="preserve"> </w:t>
       </w:r>
       <w:r>
@@ -1637,14 +1669,6 @@
           <w:sz w:val="22"/>
           <w:szCs w:val="22"/>
         </w:rPr>
-        <w:t xml:space="preserve">het </w:t>
-      </w:r>
-      <w:r>
-        <w:rPr>
-          <w:rFonts w:ascii="Courier New" w:hAnsi="Courier New" w:cs="Courier New"/>
-          <w:sz w:val="22"/>
-          <w:szCs w:val="22"/>
-        </w:rPr>
         <w:t>opnieuw doordenken</w:t>
       </w:r>
       <w:r>
@@ -1653,22 +1677,6 @@
           <w:sz w:val="22"/>
           <w:szCs w:val="22"/>
         </w:rPr>
-        <w:t xml:space="preserve"> van politieke macht en morele doelen</w:t>
-      </w:r>
-      <w:r>
-        <w:rPr>
-          <w:rFonts w:ascii="Courier New" w:hAnsi="Courier New" w:cs="Courier New"/>
-          <w:sz w:val="22"/>
-          <w:szCs w:val="22"/>
-        </w:rPr>
-        <w:t xml:space="preserve"> bij</w:t>
-      </w:r>
-      <w:r>
-        <w:rPr>
-          <w:rFonts w:ascii="Courier New" w:hAnsi="Courier New" w:cs="Courier New"/>
-          <w:sz w:val="22"/>
-          <w:szCs w:val="22"/>
-        </w:rPr>
         <w:t xml:space="preserve">. </w:t>
       </w:r>
       <w:r>
@@ -1677,15 +1685,31 @@
           <w:sz w:val="22"/>
           <w:szCs w:val="22"/>
         </w:rPr>
-        <w:t>Patočka</w:t>
-      </w:r>
-      <w:r>
-        <w:rPr>
-          <w:rFonts w:ascii="Courier New" w:hAnsi="Courier New" w:cs="Courier New"/>
-          <w:sz w:val="22"/>
-          <w:szCs w:val="22"/>
-        </w:rPr>
-        <w:t xml:space="preserve"> ontwikkelde een eigen filosofie rond vrijheid, verantwoordelijkheid en de geestelijke crisis van de moderne wereld. Hij werd internationaal bekend door zijn idee van de </w:t>
+        <w:t>Zijn filosofie</w:t>
+      </w:r>
+      <w:r>
+        <w:rPr>
+          <w:rFonts w:ascii="Courier New" w:hAnsi="Courier New" w:cs="Courier New"/>
+          <w:sz w:val="22"/>
+          <w:szCs w:val="22"/>
+        </w:rPr>
+        <w:t xml:space="preserve"> </w:t>
+      </w:r>
+      <w:r>
+        <w:rPr>
+          <w:rFonts w:ascii="Courier New" w:hAnsi="Courier New" w:cs="Courier New"/>
+          <w:sz w:val="22"/>
+          <w:szCs w:val="22"/>
+        </w:rPr>
+        <w:t>gaat over</w:t>
+      </w:r>
+      <w:r>
+        <w:rPr>
+          <w:rFonts w:ascii="Courier New" w:hAnsi="Courier New" w:cs="Courier New"/>
+          <w:sz w:val="22"/>
+          <w:szCs w:val="22"/>
+        </w:rPr>
+        <w:t xml:space="preserve"> vrijheid, verantwoordelijkheid en de geestelijke crisis van de moderne wereld. Hij werd internationaal bekend door zijn idee van de </w:t>
       </w:r>
       <w:r>
         <w:rPr>
@@ -2012,7 +2036,7 @@
           <w:sz w:val="22"/>
           <w:szCs w:val="22"/>
         </w:rPr>
-        <w:t xml:space="preserve">betrokken bij concrete menselijke nood en onrecht. Hij sprak over </w:t>
+        <w:t xml:space="preserve">betrokken bij menselijke nood en onrecht. Hij sprak over </w:t>
       </w:r>
       <w:r>
         <w:rPr>
@@ -2127,23 +2151,15 @@
           <w:sz w:val="22"/>
           <w:szCs w:val="22"/>
         </w:rPr>
-        <w:t>‘</w:t>
-      </w:r>
-      <w:r>
-        <w:rPr>
-          <w:rFonts w:ascii="Courier New" w:hAnsi="Courier New" w:cs="Courier New"/>
-          <w:sz w:val="22"/>
-          <w:szCs w:val="22"/>
-        </w:rPr>
-        <w:t>co-inherence</w:t>
-      </w:r>
-      <w:r>
-        <w:rPr>
-          <w:rFonts w:ascii="Courier New" w:hAnsi="Courier New" w:cs="Courier New"/>
-          <w:sz w:val="22"/>
-          <w:szCs w:val="22"/>
-        </w:rPr>
-        <w:t>’ (wederzijdse verbondenheid)</w:t>
+        <w:t>‘wederzijdse verbondenheid</w:t>
+      </w:r>
+      <w:r>
+        <w:rPr>
+          <w:rFonts w:ascii="Courier New" w:hAnsi="Courier New" w:cs="Courier New"/>
+          <w:sz w:val="22"/>
+          <w:szCs w:val="22"/>
+        </w:rPr>
+        <w:t>’</w:t>
       </w:r>
       <w:r>
         <w:rPr>
@@ -2614,7 +2630,79 @@
           <w:sz w:val="22"/>
           <w:szCs w:val="22"/>
         </w:rPr>
-        <w:t xml:space="preserve"> schrijft dat het woord solidariteit te pas en te onpas gebruikt </w:t>
+        <w:t xml:space="preserve"> schrijft dat het woord solidariteit te pas en te onpas gebruikt wordt</w:t>
+      </w:r>
+      <w:r>
+        <w:rPr>
+          <w:rFonts w:ascii="Courier New" w:hAnsi="Courier New" w:cs="Courier New"/>
+          <w:sz w:val="22"/>
+          <w:szCs w:val="22"/>
+        </w:rPr>
+        <w:t xml:space="preserve"> tegenwoordig</w:t>
+      </w:r>
+      <w:r>
+        <w:rPr>
+          <w:rFonts w:ascii="Courier New" w:hAnsi="Courier New" w:cs="Courier New"/>
+          <w:sz w:val="22"/>
+          <w:szCs w:val="22"/>
+        </w:rPr>
+        <w:t>. D</w:t>
+      </w:r>
+      <w:r>
+        <w:rPr>
+          <w:rFonts w:ascii="Courier New" w:hAnsi="Courier New" w:cs="Courier New"/>
+          <w:sz w:val="22"/>
+          <w:szCs w:val="22"/>
+        </w:rPr>
+        <w:t xml:space="preserve">e betekenis ervan </w:t>
+      </w:r>
+      <w:r>
+        <w:rPr>
+          <w:rFonts w:ascii="Courier New" w:hAnsi="Courier New" w:cs="Courier New"/>
+          <w:sz w:val="22"/>
+          <w:szCs w:val="22"/>
+        </w:rPr>
+        <w:t xml:space="preserve">kennen we eigenlijk </w:t>
+      </w:r>
+      <w:r>
+        <w:rPr>
+          <w:rFonts w:ascii="Courier New" w:hAnsi="Courier New" w:cs="Courier New"/>
+          <w:sz w:val="22"/>
+          <w:szCs w:val="22"/>
+        </w:rPr>
+        <w:t>helemaal niet. Zodra we er betekenis aan geven (natuurlijk</w:t>
+      </w:r>
+      <w:r>
+        <w:rPr>
+          <w:rFonts w:ascii="Courier New" w:hAnsi="Courier New" w:cs="Courier New"/>
+          <w:sz w:val="22"/>
+          <w:szCs w:val="22"/>
+        </w:rPr>
+        <w:t>,</w:t>
+      </w:r>
+      <w:r>
+        <w:rPr>
+          <w:rFonts w:ascii="Courier New" w:hAnsi="Courier New" w:cs="Courier New"/>
+          <w:sz w:val="22"/>
+          <w:szCs w:val="22"/>
+        </w:rPr>
+        <w:t xml:space="preserve"> het </w:t>
+      </w:r>
+      <w:r>
+        <w:rPr>
+          <w:rFonts w:ascii="Courier New" w:hAnsi="Courier New" w:cs="Courier New"/>
+          <w:sz w:val="22"/>
+          <w:szCs w:val="22"/>
+        </w:rPr>
+        <w:t xml:space="preserve">heeft </w:t>
+      </w:r>
+      <w:r>
+        <w:rPr>
+          <w:rFonts w:ascii="Courier New" w:hAnsi="Courier New" w:cs="Courier New"/>
+          <w:sz w:val="22"/>
+          <w:szCs w:val="22"/>
+        </w:rPr>
+        <w:t xml:space="preserve">iets </w:t>
       </w:r>
       <w:r>
         <w:rPr>
@@ -2623,47 +2711,119 @@
           <w:szCs w:val="22"/>
         </w:rPr>
         <w:lastRenderedPageBreak/>
-        <w:t>wordt</w:t>
-      </w:r>
-      <w:r>
-        <w:rPr>
-          <w:rFonts w:ascii="Courier New" w:hAnsi="Courier New" w:cs="Courier New"/>
-          <w:sz w:val="22"/>
-          <w:szCs w:val="22"/>
-        </w:rPr>
-        <w:t xml:space="preserve"> tegenwoordig</w:t>
-      </w:r>
-      <w:r>
-        <w:rPr>
-          <w:rFonts w:ascii="Courier New" w:hAnsi="Courier New" w:cs="Courier New"/>
-          <w:sz w:val="22"/>
-          <w:szCs w:val="22"/>
-        </w:rPr>
-        <w:t>. D</w:t>
-      </w:r>
-      <w:r>
-        <w:rPr>
-          <w:rFonts w:ascii="Courier New" w:hAnsi="Courier New" w:cs="Courier New"/>
-          <w:sz w:val="22"/>
-          <w:szCs w:val="22"/>
-        </w:rPr>
-        <w:t xml:space="preserve">e betekenis ervan </w:t>
-      </w:r>
-      <w:r>
-        <w:rPr>
-          <w:rFonts w:ascii="Courier New" w:hAnsi="Courier New" w:cs="Courier New"/>
-          <w:sz w:val="22"/>
-          <w:szCs w:val="22"/>
-        </w:rPr>
-        <w:t xml:space="preserve">kennen we eigenlijk </w:t>
-      </w:r>
-      <w:r>
-        <w:rPr>
-          <w:rFonts w:ascii="Courier New" w:hAnsi="Courier New" w:cs="Courier New"/>
-          <w:sz w:val="22"/>
-          <w:szCs w:val="22"/>
-        </w:rPr>
-        <w:t>helemaal niet. Zodra we er betekenis aan geven (natuurlijk</w:t>
+        <w:t xml:space="preserve">met verbintenis te maken), glipt het door onze handen en verliest het glans. En als we </w:t>
+      </w:r>
+      <w:r>
+        <w:rPr>
+          <w:rFonts w:ascii="Courier New" w:hAnsi="Courier New" w:cs="Courier New"/>
+          <w:sz w:val="22"/>
+          <w:szCs w:val="22"/>
+        </w:rPr>
+        <w:t>het toch</w:t>
+      </w:r>
+      <w:r>
+        <w:rPr>
+          <w:rFonts w:ascii="Courier New" w:hAnsi="Courier New" w:cs="Courier New"/>
+          <w:sz w:val="22"/>
+          <w:szCs w:val="22"/>
+        </w:rPr>
+        <w:t xml:space="preserve"> proberen, heeft het </w:t>
+      </w:r>
+      <w:r>
+        <w:rPr>
+          <w:rFonts w:ascii="Courier New" w:hAnsi="Courier New" w:cs="Courier New"/>
+          <w:sz w:val="22"/>
+          <w:szCs w:val="22"/>
+        </w:rPr>
+        <w:t>uiteindelijk vaak</w:t>
+      </w:r>
+      <w:r>
+        <w:rPr>
+          <w:rFonts w:ascii="Courier New" w:hAnsi="Courier New" w:cs="Courier New"/>
+          <w:sz w:val="22"/>
+          <w:szCs w:val="22"/>
+        </w:rPr>
+        <w:t xml:space="preserve"> met de hoe-vraag te maken, </w:t>
+      </w:r>
+      <w:r>
+        <w:rPr>
+          <w:rFonts w:ascii="Courier New" w:hAnsi="Courier New" w:cs="Courier New"/>
+          <w:sz w:val="22"/>
+          <w:szCs w:val="22"/>
+        </w:rPr>
+        <w:t>zoiets als:</w:t>
+      </w:r>
+      <w:r>
+        <w:rPr>
+          <w:rFonts w:ascii="Courier New" w:hAnsi="Courier New" w:cs="Courier New"/>
+          <w:sz w:val="22"/>
+          <w:szCs w:val="22"/>
+        </w:rPr>
+        <w:t xml:space="preserve"> iedereen moet zijn of haar steente bijdragen. Op </w:t>
+      </w:r>
+      <w:r>
+        <w:rPr>
+          <w:rFonts w:ascii="Courier New" w:hAnsi="Courier New" w:cs="Courier New"/>
+          <w:sz w:val="22"/>
+          <w:szCs w:val="22"/>
+        </w:rPr>
+        <w:t xml:space="preserve">de vraag </w:t>
+      </w:r>
+      <w:r>
+        <w:rPr>
+          <w:rFonts w:ascii="Courier New" w:hAnsi="Courier New" w:cs="Courier New"/>
+          <w:sz w:val="22"/>
+          <w:szCs w:val="22"/>
+        </w:rPr>
+        <w:t xml:space="preserve">waarom solidariteit zo belangrijk is, daar gaat het natuurlijk om, blijven we stil. Dat is wat Bos duidelijk wil maken. </w:t>
+      </w:r>
+      <w:r>
+        <w:rPr>
+          <w:rFonts w:ascii="Courier New" w:hAnsi="Courier New" w:cs="Courier New"/>
+          <w:sz w:val="22"/>
+          <w:szCs w:val="22"/>
+        </w:rPr>
+        <w:t>Dat we eigenlijk met z’n allen blind zijn geworden om verbindingen aan te gaan met mensen die we niet kennen of waar we niets van weten. Dat het goed is om meer gemeenschappe</w:t>
+      </w:r>
+      <w:r>
+        <w:rPr>
+          <w:rFonts w:ascii="Courier New" w:hAnsi="Courier New" w:cs="Courier New"/>
+          <w:sz w:val="22"/>
+          <w:szCs w:val="22"/>
+        </w:rPr>
+        <w:t>-</w:t>
+      </w:r>
+      <w:r>
+        <w:rPr>
+          <w:rFonts w:ascii="Courier New" w:hAnsi="Courier New" w:cs="Courier New"/>
+          <w:sz w:val="22"/>
+          <w:szCs w:val="22"/>
+        </w:rPr>
+        <w:t xml:space="preserve">lijkheid te creëren en om diepere, stabielere en eerlijkere vormen van solidariteit aan te gaan. </w:t>
+      </w:r>
+      <w:r>
+        <w:rPr>
+          <w:rFonts w:ascii="Courier New" w:hAnsi="Courier New" w:cs="Courier New"/>
+          <w:sz w:val="22"/>
+          <w:szCs w:val="22"/>
+        </w:rPr>
+        <w:t>S</w:t>
+      </w:r>
+      <w:r>
+        <w:rPr>
+          <w:rFonts w:ascii="Courier New" w:hAnsi="Courier New" w:cs="Courier New"/>
+          <w:sz w:val="22"/>
+          <w:szCs w:val="22"/>
+        </w:rPr>
+        <w:t>olidariteit</w:t>
+      </w:r>
+      <w:r>
+        <w:rPr>
+          <w:rFonts w:ascii="Courier New" w:hAnsi="Courier New" w:cs="Courier New"/>
+          <w:sz w:val="22"/>
+          <w:szCs w:val="22"/>
+        </w:rPr>
+        <w:t xml:space="preserve"> eerst maar eens zoeken in kleinere</w:t>
       </w:r>
       <w:r>
         <w:rPr>
@@ -2679,135 +2839,87 @@
           <w:sz w:val="22"/>
           <w:szCs w:val="22"/>
         </w:rPr>
-        <w:t xml:space="preserve"> het </w:t>
-      </w:r>
-      <w:r>
-        <w:rPr>
-          <w:rFonts w:ascii="Courier New" w:hAnsi="Courier New" w:cs="Courier New"/>
-          <w:sz w:val="22"/>
-          <w:szCs w:val="22"/>
-        </w:rPr>
-        <w:t xml:space="preserve">heeft </w:t>
-      </w:r>
-      <w:r>
-        <w:rPr>
-          <w:rFonts w:ascii="Courier New" w:hAnsi="Courier New" w:cs="Courier New"/>
-          <w:sz w:val="22"/>
-          <w:szCs w:val="22"/>
-        </w:rPr>
-        <w:t xml:space="preserve">iets met verbintenis te maken), glipt het door onze handen en verliest het glans. En als we </w:t>
-      </w:r>
-      <w:r>
-        <w:rPr>
-          <w:rFonts w:ascii="Courier New" w:hAnsi="Courier New" w:cs="Courier New"/>
-          <w:sz w:val="22"/>
-          <w:szCs w:val="22"/>
-        </w:rPr>
-        <w:t>het toch</w:t>
-      </w:r>
-      <w:r>
-        <w:rPr>
-          <w:rFonts w:ascii="Courier New" w:hAnsi="Courier New" w:cs="Courier New"/>
-          <w:sz w:val="22"/>
-          <w:szCs w:val="22"/>
-        </w:rPr>
-        <w:t xml:space="preserve"> proberen, heeft het </w:t>
-      </w:r>
-      <w:r>
-        <w:rPr>
-          <w:rFonts w:ascii="Courier New" w:hAnsi="Courier New" w:cs="Courier New"/>
-          <w:sz w:val="22"/>
-          <w:szCs w:val="22"/>
-        </w:rPr>
-        <w:t>uiteindelijk vaak</w:t>
-      </w:r>
-      <w:r>
-        <w:rPr>
-          <w:rFonts w:ascii="Courier New" w:hAnsi="Courier New" w:cs="Courier New"/>
-          <w:sz w:val="22"/>
-          <w:szCs w:val="22"/>
-        </w:rPr>
-        <w:t xml:space="preserve"> met de hoe-vraag te maken, </w:t>
-      </w:r>
-      <w:r>
-        <w:rPr>
-          <w:rFonts w:ascii="Courier New" w:hAnsi="Courier New" w:cs="Courier New"/>
-          <w:sz w:val="22"/>
-          <w:szCs w:val="22"/>
-        </w:rPr>
-        <w:t>zoiets als:</w:t>
-      </w:r>
-      <w:r>
-        <w:rPr>
-          <w:rFonts w:ascii="Courier New" w:hAnsi="Courier New" w:cs="Courier New"/>
-          <w:sz w:val="22"/>
-          <w:szCs w:val="22"/>
-        </w:rPr>
-        <w:t xml:space="preserve"> iedereen moet zijn of haar steente bijdragen. Op </w:t>
-      </w:r>
-      <w:r>
-        <w:rPr>
-          <w:rFonts w:ascii="Courier New" w:hAnsi="Courier New" w:cs="Courier New"/>
-          <w:sz w:val="22"/>
-          <w:szCs w:val="22"/>
-        </w:rPr>
-        <w:t xml:space="preserve">de vraag </w:t>
-      </w:r>
-      <w:r>
-        <w:rPr>
-          <w:rFonts w:ascii="Courier New" w:hAnsi="Courier New" w:cs="Courier New"/>
-          <w:sz w:val="22"/>
-          <w:szCs w:val="22"/>
-        </w:rPr>
-        <w:t xml:space="preserve">waarom solidariteit zo belangrijk is, daar gaat het natuurlijk om, blijven we stil. Dat is wat Bos duidelijk wil maken. </w:t>
-      </w:r>
-      <w:r>
-        <w:rPr>
-          <w:rFonts w:ascii="Courier New" w:hAnsi="Courier New" w:cs="Courier New"/>
-          <w:sz w:val="22"/>
-          <w:szCs w:val="22"/>
-        </w:rPr>
-        <w:t>Dat we eigenlijk met z’n allen blind zijn geworden om verbindingen aan te gaan met mensen die we niet kennen of waar we niets van weten. Dat het goed is om meer gemeenschappe</w:t>
-      </w:r>
-      <w:r>
-        <w:rPr>
-          <w:rFonts w:ascii="Courier New" w:hAnsi="Courier New" w:cs="Courier New"/>
-          <w:sz w:val="22"/>
-          <w:szCs w:val="22"/>
-        </w:rPr>
-        <w:t>-</w:t>
-      </w:r>
-      <w:r>
-        <w:rPr>
-          <w:rFonts w:ascii="Courier New" w:hAnsi="Courier New" w:cs="Courier New"/>
-          <w:sz w:val="22"/>
-          <w:szCs w:val="22"/>
-        </w:rPr>
-        <w:t xml:space="preserve">lijkheid te creëren en om diepere, stabielere en eerlijkere vormen van solidariteit aan te gaan. </w:t>
-      </w:r>
-      <w:r>
-        <w:rPr>
-          <w:rFonts w:ascii="Courier New" w:hAnsi="Courier New" w:cs="Courier New"/>
-          <w:sz w:val="22"/>
-          <w:szCs w:val="22"/>
-        </w:rPr>
-        <w:t>S</w:t>
-      </w:r>
-      <w:r>
-        <w:rPr>
-          <w:rFonts w:ascii="Courier New" w:hAnsi="Courier New" w:cs="Courier New"/>
-          <w:sz w:val="22"/>
-          <w:szCs w:val="22"/>
-        </w:rPr>
-        <w:t>olidariteit</w:t>
-      </w:r>
-      <w:r>
-        <w:rPr>
-          <w:rFonts w:ascii="Courier New" w:hAnsi="Courier New" w:cs="Courier New"/>
-          <w:sz w:val="22"/>
-          <w:szCs w:val="22"/>
-        </w:rPr>
-        <w:t xml:space="preserve"> eerst maar eens zoeken in kleinere</w:t>
+        <w:t xml:space="preserve"> alledaagse gestes en vluchtige solidariteit als een groet, een handdruk, een compliment, een uitnodiging of een grap. </w:t>
+      </w:r>
+      <w:r>
+        <w:rPr>
+          <w:rFonts w:ascii="Courier New" w:hAnsi="Courier New" w:cs="Courier New"/>
+          <w:sz w:val="22"/>
+          <w:szCs w:val="22"/>
+        </w:rPr>
+        <w:t xml:space="preserve">Zelfs dit </w:t>
+      </w:r>
+      <w:r>
+        <w:rPr>
+          <w:rFonts w:ascii="Courier New" w:hAnsi="Courier New" w:cs="Courier New"/>
+          <w:sz w:val="22"/>
+          <w:szCs w:val="22"/>
+        </w:rPr>
+        <w:t xml:space="preserve">durft </w:t>
+      </w:r>
+      <w:r>
+        <w:rPr>
+          <w:rFonts w:ascii="Courier New" w:hAnsi="Courier New" w:cs="Courier New"/>
+          <w:sz w:val="22"/>
+          <w:szCs w:val="22"/>
+        </w:rPr>
+        <w:t>Bos</w:t>
+      </w:r>
+      <w:r>
+        <w:rPr>
+          <w:rFonts w:ascii="Courier New" w:hAnsi="Courier New" w:cs="Courier New"/>
+          <w:sz w:val="22"/>
+          <w:szCs w:val="22"/>
+        </w:rPr>
+        <w:t xml:space="preserve"> nauwelijks echt uit te spreken omdat hij weet dat het </w:t>
+      </w:r>
+      <w:r>
+        <w:rPr>
+          <w:rFonts w:ascii="Courier New" w:hAnsi="Courier New" w:cs="Courier New"/>
+          <w:sz w:val="22"/>
+          <w:szCs w:val="22"/>
+        </w:rPr>
+        <w:t xml:space="preserve">er op dit moment </w:t>
+      </w:r>
+      <w:r>
+        <w:rPr>
+          <w:rFonts w:ascii="Courier New" w:hAnsi="Courier New" w:cs="Courier New"/>
+          <w:sz w:val="22"/>
+          <w:szCs w:val="22"/>
+        </w:rPr>
+        <w:t>niet de wereld naar is</w:t>
+      </w:r>
+      <w:r>
+        <w:rPr>
+          <w:rFonts w:ascii="Courier New" w:hAnsi="Courier New" w:cs="Courier New"/>
+          <w:sz w:val="22"/>
+          <w:szCs w:val="22"/>
+        </w:rPr>
+        <w:t>; e</w:t>
+      </w:r>
+      <w:r>
+        <w:rPr>
+          <w:rFonts w:ascii="Courier New" w:hAnsi="Courier New" w:cs="Courier New"/>
+          <w:sz w:val="22"/>
+          <w:szCs w:val="22"/>
+        </w:rPr>
+        <w:t xml:space="preserve">r </w:t>
+      </w:r>
+      <w:r>
+        <w:rPr>
+          <w:rFonts w:ascii="Courier New" w:hAnsi="Courier New" w:cs="Courier New"/>
+          <w:sz w:val="22"/>
+          <w:szCs w:val="22"/>
+        </w:rPr>
+        <w:t xml:space="preserve">zijn </w:t>
+      </w:r>
+      <w:r>
+        <w:rPr>
+          <w:rFonts w:ascii="Courier New" w:hAnsi="Courier New" w:cs="Courier New"/>
+          <w:sz w:val="22"/>
+          <w:szCs w:val="22"/>
+        </w:rPr>
+        <w:t>genoeg mensen die dit</w:t>
       </w:r>
       <w:r>
         <w:rPr>
@@ -2823,87 +2935,23 @@
           <w:sz w:val="22"/>
           <w:szCs w:val="22"/>
         </w:rPr>
-        <w:t xml:space="preserve"> alledaagse gestes en vluchtige solidariteit als een groet, een handdruk, een compliment, een uitnodiging of een grap. </w:t>
-      </w:r>
-      <w:r>
-        <w:rPr>
-          <w:rFonts w:ascii="Courier New" w:hAnsi="Courier New" w:cs="Courier New"/>
-          <w:sz w:val="22"/>
-          <w:szCs w:val="22"/>
-        </w:rPr>
-        <w:t xml:space="preserve">Zelfs dit </w:t>
-      </w:r>
-      <w:r>
-        <w:rPr>
-          <w:rFonts w:ascii="Courier New" w:hAnsi="Courier New" w:cs="Courier New"/>
-          <w:sz w:val="22"/>
-          <w:szCs w:val="22"/>
-        </w:rPr>
-        <w:t xml:space="preserve">durft </w:t>
-      </w:r>
-      <w:r>
-        <w:rPr>
-          <w:rFonts w:ascii="Courier New" w:hAnsi="Courier New" w:cs="Courier New"/>
-          <w:sz w:val="22"/>
-          <w:szCs w:val="22"/>
-        </w:rPr>
-        <w:t>Bos</w:t>
-      </w:r>
-      <w:r>
-        <w:rPr>
-          <w:rFonts w:ascii="Courier New" w:hAnsi="Courier New" w:cs="Courier New"/>
-          <w:sz w:val="22"/>
-          <w:szCs w:val="22"/>
-        </w:rPr>
-        <w:t xml:space="preserve"> nauwelijks echt uit te spreken omdat hij weet dat het </w:t>
-      </w:r>
-      <w:r>
-        <w:rPr>
-          <w:rFonts w:ascii="Courier New" w:hAnsi="Courier New" w:cs="Courier New"/>
-          <w:sz w:val="22"/>
-          <w:szCs w:val="22"/>
-        </w:rPr>
-        <w:t xml:space="preserve">er op dit moment </w:t>
-      </w:r>
-      <w:r>
-        <w:rPr>
-          <w:rFonts w:ascii="Courier New" w:hAnsi="Courier New" w:cs="Courier New"/>
-          <w:sz w:val="22"/>
-          <w:szCs w:val="22"/>
-        </w:rPr>
-        <w:t>niet de wereld naar is</w:t>
-      </w:r>
-      <w:r>
-        <w:rPr>
-          <w:rFonts w:ascii="Courier New" w:hAnsi="Courier New" w:cs="Courier New"/>
-          <w:sz w:val="22"/>
-          <w:szCs w:val="22"/>
-        </w:rPr>
-        <w:t>; e</w:t>
-      </w:r>
-      <w:r>
-        <w:rPr>
-          <w:rFonts w:ascii="Courier New" w:hAnsi="Courier New" w:cs="Courier New"/>
-          <w:sz w:val="22"/>
-          <w:szCs w:val="22"/>
-        </w:rPr>
-        <w:t xml:space="preserve">r </w:t>
-      </w:r>
-      <w:r>
-        <w:rPr>
-          <w:rFonts w:ascii="Courier New" w:hAnsi="Courier New" w:cs="Courier New"/>
-          <w:sz w:val="22"/>
-          <w:szCs w:val="22"/>
-        </w:rPr>
-        <w:t xml:space="preserve">zijn </w:t>
-      </w:r>
-      <w:r>
-        <w:rPr>
-          <w:rFonts w:ascii="Courier New" w:hAnsi="Courier New" w:cs="Courier New"/>
-          <w:sz w:val="22"/>
-          <w:szCs w:val="22"/>
-        </w:rPr>
-        <w:t xml:space="preserve">genoeg mensen die dit om welke reden dan ook onderuit zullen halen. Bos laat </w:t>
+        <w:t xml:space="preserve"> om welke reden dan ook</w:t>
+      </w:r>
+      <w:r>
+        <w:rPr>
+          <w:rFonts w:ascii="Courier New" w:hAnsi="Courier New" w:cs="Courier New"/>
+          <w:sz w:val="22"/>
+          <w:szCs w:val="22"/>
+        </w:rPr>
+        <w:t>,</w:t>
+      </w:r>
+      <w:r>
+        <w:rPr>
+          <w:rFonts w:ascii="Courier New" w:hAnsi="Courier New" w:cs="Courier New"/>
+          <w:sz w:val="22"/>
+          <w:szCs w:val="22"/>
+        </w:rPr>
+        <w:t xml:space="preserve"> onderuit zullen halen. Bos laat </w:t>
       </w:r>
       <w:r>
         <w:rPr>
@@ -3460,7 +3508,39 @@
           <w:sz w:val="22"/>
           <w:szCs w:val="22"/>
         </w:rPr>
-        <w:t xml:space="preserve">uit het besef dat mensen fundamenteel afhankelijk </w:t>
+        <w:t xml:space="preserve">uit het besef dat mensen fundamenteel afhankelijk zijn van elkaar en </w:t>
+      </w:r>
+      <w:r>
+        <w:rPr>
+          <w:rFonts w:ascii="Courier New" w:hAnsi="Courier New" w:cs="Courier New"/>
+          <w:sz w:val="22"/>
+          <w:szCs w:val="22"/>
+        </w:rPr>
+        <w:t xml:space="preserve">ze </w:t>
+      </w:r>
+      <w:r>
+        <w:rPr>
+          <w:rFonts w:ascii="Courier New" w:hAnsi="Courier New" w:cs="Courier New"/>
+          <w:sz w:val="22"/>
+          <w:szCs w:val="22"/>
+        </w:rPr>
+        <w:t xml:space="preserve">elkaars kwetsbaarheid delen. Wat een ander bedreigt, raakt ook onszelf. Solidariteit </w:t>
+      </w:r>
+      <w:r>
+        <w:rPr>
+          <w:rFonts w:ascii="Courier New" w:hAnsi="Courier New" w:cs="Courier New"/>
+          <w:sz w:val="22"/>
+          <w:szCs w:val="22"/>
+        </w:rPr>
+        <w:t>dus niet als een</w:t>
+      </w:r>
+      <w:r>
+        <w:rPr>
+          <w:rFonts w:ascii="Courier New" w:hAnsi="Courier New" w:cs="Courier New"/>
+          <w:sz w:val="22"/>
+          <w:szCs w:val="22"/>
+        </w:rPr>
+        <w:t xml:space="preserve"> </w:t>
       </w:r>
       <w:r>
         <w:rPr>
@@ -3469,39 +3549,7 @@
           <w:szCs w:val="22"/>
         </w:rPr>
         <w:lastRenderedPageBreak/>
-        <w:t xml:space="preserve">zijn van elkaar en </w:t>
-      </w:r>
-      <w:r>
-        <w:rPr>
-          <w:rFonts w:ascii="Courier New" w:hAnsi="Courier New" w:cs="Courier New"/>
-          <w:sz w:val="22"/>
-          <w:szCs w:val="22"/>
-        </w:rPr>
-        <w:t xml:space="preserve">ze </w:t>
-      </w:r>
-      <w:r>
-        <w:rPr>
-          <w:rFonts w:ascii="Courier New" w:hAnsi="Courier New" w:cs="Courier New"/>
-          <w:sz w:val="22"/>
-          <w:szCs w:val="22"/>
-        </w:rPr>
-        <w:t xml:space="preserve">elkaars kwetsbaarheid delen. Wat een ander bedreigt, raakt ook onszelf. Solidariteit </w:t>
-      </w:r>
-      <w:r>
-        <w:rPr>
-          <w:rFonts w:ascii="Courier New" w:hAnsi="Courier New" w:cs="Courier New"/>
-          <w:sz w:val="22"/>
-          <w:szCs w:val="22"/>
-        </w:rPr>
-        <w:t>dus niet als een</w:t>
-      </w:r>
-      <w:r>
-        <w:rPr>
-          <w:rFonts w:ascii="Courier New" w:hAnsi="Courier New" w:cs="Courier New"/>
-          <w:sz w:val="22"/>
-          <w:szCs w:val="22"/>
-        </w:rPr>
-        <w:t xml:space="preserve"> oppervlakkig gevoel, maar </w:t>
+        <w:t xml:space="preserve">oppervlakkig gevoel, maar </w:t>
       </w:r>
       <w:r>
         <w:rPr>
@@ -4163,16 +4211,7 @@
           <w:sz w:val="22"/>
           <w:szCs w:val="22"/>
         </w:rPr>
-        <w:t xml:space="preserve">dat </w:t>
-      </w:r>
-      <w:r>
-        <w:rPr>
-          <w:rFonts w:ascii="Courier New" w:hAnsi="Courier New" w:cs="Courier New"/>
-          <w:sz w:val="22"/>
-          <w:szCs w:val="22"/>
-        </w:rPr>
-        <w:lastRenderedPageBreak/>
-        <w:t xml:space="preserve">ze </w:t>
+        <w:t xml:space="preserve">dat ze </w:t>
       </w:r>
       <w:r>
         <w:rPr>
@@ -4241,6 +4280,7 @@
           <w:sz w:val="22"/>
           <w:szCs w:val="22"/>
         </w:rPr>
+        <w:lastRenderedPageBreak/>
         <w:t>Solidarity: The Work of Recognition</w:t>
       </w:r>
       <w:r>
@@ -4249,15 +4289,31 @@
           <w:sz w:val="22"/>
           <w:szCs w:val="22"/>
         </w:rPr>
-        <w:t xml:space="preserve"> is geen gemakkelijk boek en soms vraag je jezelf af of je het wel helemaal goed begrijpt. Het is een boek dat je soms opnieuw moet pakken om bepaalde delen nog eens te lezen. Het is ook een christelijk boek waar ik soms, met excuses, omheen lees. Maar het is ook een boek dat ons op een orginele manier naar de wereld en de mens laat kijken.</w:t>
-      </w:r>
-      <w:r>
-        <w:rPr>
-          <w:rFonts w:ascii="Courier New" w:hAnsi="Courier New" w:cs="Courier New"/>
-          <w:sz w:val="22"/>
-          <w:szCs w:val="22"/>
-        </w:rPr>
-        <w:t xml:space="preserve"> Een boek dat ons uitnodigt om van solidariteit werk te maken.</w:t>
+        <w:t xml:space="preserve"> is geen gemakkelijk boek en soms vraag je jezelf af of je het wel helemaal goed begrijpt. Het is een boek dat je soms opnieuw moet pakken om bepaalde delen nog eens te lezen. Het is ook een christelijk boek waar ik, met excuses, omheen lees. Maar het is een boek dat ons op een orginele manier naar de wereld en de mens laat kijken.</w:t>
+      </w:r>
+      <w:r>
+        <w:rPr>
+          <w:rFonts w:ascii="Courier New" w:hAnsi="Courier New" w:cs="Courier New"/>
+          <w:sz w:val="22"/>
+          <w:szCs w:val="22"/>
+        </w:rPr>
+        <w:t xml:space="preserve"> Een boek dat ons </w:t>
+      </w:r>
+      <w:r>
+        <w:rPr>
+          <w:rFonts w:ascii="Courier New" w:hAnsi="Courier New" w:cs="Courier New"/>
+          <w:sz w:val="22"/>
+          <w:szCs w:val="22"/>
+        </w:rPr>
+        <w:t xml:space="preserve">van harte </w:t>
+      </w:r>
+      <w:r>
+        <w:rPr>
+          <w:rFonts w:ascii="Courier New" w:hAnsi="Courier New" w:cs="Courier New"/>
+          <w:sz w:val="22"/>
+          <w:szCs w:val="22"/>
+        </w:rPr>
+        <w:t>uitnodigt om van solidariteit werk te maken.</w:t>
       </w:r>
       <w:r>
         <w:rPr>
@@ -4385,6 +4441,14 @@
           <w:szCs w:val="22"/>
         </w:rPr>
         <w:t xml:space="preserve"> London: Bloomsbury Continuum. </w:t>
+      </w:r>
+      <w:r>
+        <w:rPr>
+          <w:rFonts w:ascii="Courier New" w:hAnsi="Courier New" w:cs="Courier New"/>
+          <w:sz w:val="22"/>
+          <w:szCs w:val="22"/>
+        </w:rPr>
+        <w:t>320 pagina’s</w:t>
       </w:r>
       <w:r>
         <w:rPr>

</xml_diff>